<commit_message>
Living change records: round-4 entries (post-DB-fix verification, survey hierarchy, bridged questions, header-only clock)
https://claude.ai/code/session_01JbfZmzoHzkF8tUdxhNPCER
</commit_message>
<xml_diff>
--- a/Brief_Change_Record.docx
+++ b/Brief_Change_Record.docx
@@ -174,7 +174,29 @@
         <w:t>Natural questioning</w:t>
       </w:r>
       <w:r>
-        <w:t>: the future self may end with at most ONE question, and only when it grows out of what was just said; abrupt interview-style pivots (e.g. "What stopped you in the past from walking away from something hard?") are explicitly forbidden; if no question arises naturally, the reply ends with an opening instead. Rationale: pilot user experience — abrupt probes broke immersion and felt obligating. The KEEP-LEARNING goals (understanding the participant's present) are unchanged; only the delivery is constrained.</w:t>
+        <w:t>: the future self may end with at most ONE question, and only when it grows out of what was just said; abrupt interview-style pivots (e.g. "What stopped you in the past from walking away from something hard?") are explicitly forbidden; if no question arises naturally, the reply ends with an opening instead. Second revision (same day): every question must additionally be BRIDGED into by a connecting sentence ("...which is making me wonder —") so it reads as caused by the preceding thought — bare questions, even on-topic ones, still felt abrupt. Rationale: pilot user experience — abrupt probes broke immersion and felt obligating. The KEEP-LEARNING goals (understanding the participant's present) are unchanged; only the delivery is constrained.</w:t>
+      </w:r>
+    </w:p>
+    <w:p>
+      <w:r>
+        <w:rPr>
+          <w:i/>
+        </w:rPr>
+        <w:t>Note on the time anchor:</w:t>
+      </w:r>
+      <w:r>
+        <w:t xml:space="preserve"> the dates are computed at the moment each conversation starts (</w:t>
+      </w:r>
+      <w:r>
+        <w:rPr>
+          <w:rFonts w:ascii="Consolas" w:hAnsi="Consolas"/>
+          <w:color w:val="7A3318"/>
+          <w:sz w:val="19"/>
+        </w:rPr>
+        <w:t>new Date()</w:t>
+      </w:r>
+      <w:r>
+        <w:t xml:space="preserve"> in the prompt builder) — never a fixed "June 2026". Every session's prompt names the actual current month/year and its +10-year counterpart.</w:t>
       </w:r>
     </w:p>
     <w:p>
@@ -313,7 +335,7 @@
         <w:t>Survey readability</w:t>
       </w:r>
       <w:r>
-        <w:t>: item text leads at a clearly larger size than response chrome; legends/hints lightened; blocks given air. The IOS instruction's key phrase is emphasized in capitals (CLOSE AND OVERLAPPING) to match the FSCS items — typographic emphasis only; instrument wording, scales and anchors untouched.</w:t>
+        <w:t>: item text leads at a clearly larger size than response chrome; legends/hints lightened; blocks given air. The IOS instruction's key phrase is emphasized in capitals (CLOSE AND OVERLAPPING) to match the FSCS items — typographic emphasis only; instrument wording, scales and anchors untouched. Second pass (same day): every survey page opens with a real serif heading and the task instruction in body ink, giving each page an unmistakable reading entry point.</w:t>
       </w:r>
     </w:p>
     <w:p>
@@ -441,10 +463,10 @@
         <w:rPr>
           <w:b/>
         </w:rPr>
-        <w:t>Database misconfiguration diagnosed</w:t>
+        <w:t>Database misconfiguration diagnosed and RESOLVED</w:t>
       </w:r>
       <w:r>
-        <w:t xml:space="preserve"> (live </w:t>
+        <w:t xml:space="preserve"> (2026-06-11 evening): the live </w:t>
       </w:r>
       <w:r>
         <w:rPr>
@@ -455,7 +477,7 @@
         <w:t>DATABASE_URL</w:t>
       </w:r>
       <w:r>
-        <w:t xml:space="preserve"> pointed at localhost): admin now states the cause and the exact Railway fix (</w:t>
+        <w:t xml:space="preserve"> pointed at localhost; Kangzhi set it to the </w:t>
       </w:r>
       <w:r>
         <w:rPr>
@@ -466,7 +488,7 @@
         <w:t>${{Postgres.DATABASE_URL}}</w:t>
       </w:r>
       <w:r>
-        <w:t xml:space="preserve"> reference). Until fixed, sessions are in-memory only — DO NOT field before </w:t>
+        <w:t xml:space="preserve"> reference. </w:t>
       </w:r>
       <w:r>
         <w:rPr>
@@ -477,7 +499,7 @@
         <w:t>/healthz</w:t>
       </w:r>
       <w:r>
-        <w:t xml:space="preserve"> shows </w:t>
+        <w:t xml:space="preserve"> now shows </w:t>
       </w:r>
       <w:r>
         <w:rPr>
@@ -488,7 +510,7 @@
         <w:t>"db": true</w:t>
       </w:r>
       <w:r>
-        <w:t>.</w:t>
+        <w:t>; sessions persist; the full admin surface (list, detail, exports, descriptives, resume links) verified against real data.</w:t>
       </w:r>
     </w:p>
     <w:p>

</xml_diff>

<commit_message>
Living change records: round-6 entries (timeline discipline, survey pagination, exploration hub)
https://claude.ai/code/session_01JbfZmzoHzkF8tUdxhNPCER
</commit_message>
<xml_diff>
--- a/Brief_Change_Record.docx
+++ b/Brief_Change_Record.docx
@@ -290,6 +290,43 @@
     </w:p>
     <w:p>
       <w:pPr>
+        <w:pStyle w:val="Heading2"/>
+      </w:pPr>
+      <w:r>
+        <w:t>1.4 Timeline discipline in the role-play (both arms, 2026-06-12)</w:t>
+      </w:r>
+    </w:p>
+    <w:p>
+      <w:r>
+        <w:t>The future self's invented autobiography must begin at the participant's current age/study year: every fabricated memory lives inside the ten years between their present and the bot's present. Events at or before the participant's "now" may only be referenced through what the participant has shared or through light generic textures — never as invented specifics, because the participant actually lived those years (a third-year being told a fabricated "our second year" story experiences an immersion-breaking contradiction). The baseline, which receives no profile, keeps all references to the past generic. Live-verified in both arms.</w:t>
+      </w:r>
+    </w:p>
+    <w:p>
+      <w:pPr>
+        <w:pStyle w:val="Heading2"/>
+      </w:pPr>
+      <w:r>
+        <w:t>1.5 Post-study exploration (new, outside the analysis; 2026-06-12)</w:t>
+      </w:r>
+    </w:p>
+    <w:p>
+      <w:r>
+        <w:t xml:space="preserve">After the post-survey the participant reaches a hub with three options: continue the same conversation, step into a DIFFERENT career (a fresh career-selection chat followed by a new role-play — repeatable without limit, switchable mid- conversation), or finish. Everything after the post-survey remains recorded (under </w:t>
+      </w:r>
+      <w:r>
+        <w:rPr>
+          <w:rFonts w:ascii="Consolas" w:hAnsi="Consolas"/>
+          <w:color w:val="7A3318"/>
+          <w:sz w:val="19"/>
+        </w:rPr>
+        <w:t>freeContinuation.explorations</w:t>
+      </w:r>
+      <w:r>
+        <w:t>) but is never part of the main analysis; exploration role-plays run the full main prompt with no time policy. The feature is announced on the landing "How it works" modal and the pre-post-survey pause. Rationale: participant value (free exploration as a thank-you) without touching the measured flow — all instruments are completed before the hub is reachable.</w:t>
+      </w:r>
+    </w:p>
+    <w:p>
+      <w:pPr>
         <w:pStyle w:val="Heading1"/>
       </w:pPr>
       <w:r>
@@ -335,7 +372,7 @@
         <w:t>Survey readability</w:t>
       </w:r>
       <w:r>
-        <w:t>: item text leads at a clearly larger size than response chrome; legends/hints lightened; blocks given air. The IOS instruction's key phrase is emphasized in capitals (CLOSE AND OVERLAPPING) to match the FSCS items — typographic emphasis only; instrument wording, scales and anchors untouched. Second pass (same day): every survey page opens with a real serif heading and the task instruction in body ink, giving each page an unmistakable reading entry point.</w:t>
+        <w:t>: item text leads at a clearly larger size than response chrome; legends/hints lightened; blocks given air. The IOS instruction's key phrase is emphasized in capitals (CLOSE AND OVERLAPPING) to match the FSCS items — typographic emphasis only; instrument wording, scales and anchors untouched. Second pass (same day): every survey page opens with a real serif heading and the task instruction in body ink, giving each page an unmistakable reading entry point. Third pass (2026-06-12): headings centered and oversized (30–38 px), and pages shortened to ~5 items each — TIPI split 5+5 (verbatim instruction repeated on both pages), circles and vividness separated, CDSE-SA and CIP-CCA one page each (pre 9 pages, post 7). Pagination only; every item, scale and anchor unchanged.</w:t>
       </w:r>
     </w:p>
     <w:p>

</xml_diff>

<commit_message>
Living change records: round-7 entries (career check, preview, Recruit, resume continuity, baseline clarification)
https://claude.ai/code/session_01JbfZmzoHzkF8tUdxhNPCER
</commit_message>
<xml_diff>
--- a/Brief_Change_Record.docx
+++ b/Brief_Change_Record.docx
@@ -414,6 +414,75 @@
     </w:p>
     <w:p>
       <w:pPr>
+        <w:pStyle w:val="Heading2"/>
+      </w:pPr>
+      <w:r>
+        <w:t>1.6 Career lock-in sanity check (2026-06-12)</w:t>
+      </w:r>
+    </w:p>
+    <w:p>
+      <w:r>
+        <w:t>The stage-B lock-in now model-validates free-typed careers before the role-play can start: gibberish/jokes ("haha") are rejected with a friendly inline prompt to name a real career. The check is fail-open (an unreachable validator never blocks a participant) and is skipped for card-chosen titles, which the model itself proposed. Closes a validity hole: a nonsense "career" would have produced an uninterpretable role-play exposure. Applies to the post-study exploration picker too.</w:t>
+      </w:r>
+    </w:p>
+    <w:p>
+      <w:pPr>
+        <w:pStyle w:val="Heading2"/>
+      </w:pPr>
+      <w:r>
+        <w:t>1.7 Baseline isolation re-confirmed (2026-06-12, researcher question)</w:t>
+      </w:r>
+    </w:p>
+    <w:p>
+      <w:r>
+        <w:t>Re-checked against Brief v4.1 §3.3/§3.4 and Build Plan v5.1 §6: the baseline stage-C bot receives the chosen career + negotiated location and NOTHING else — no pre-survey answers, no stage-B content. (Both arms experience identical stages A and B, and the stage-B guide uses the profile in BOTH conditions; the isolation applies to what the stage-C role-play bot is told.) Rationale in §3.3: profile- grounding is itself part of the manipulation under test. The deployed code matches the documents.</w:t>
+      </w:r>
+    </w:p>
+    <w:p>
+      <w:pPr>
+        <w:pStyle w:val="Heading1"/>
+      </w:pPr>
+      <w:r>
+        <w:t>2a. Researcher tooling (fielding)</w:t>
+      </w:r>
+    </w:p>
+    <w:p>
+      <w:pPr>
+        <w:pStyle w:val="ListBullet"/>
+      </w:pPr>
+      <w:r>
+        <w:t>Admin "Recruit" tab (first tab): pick the study cell, batch-mint sequential-PID participant links (batches persist in the browser), one link per participant.</w:t>
+      </w:r>
+    </w:p>
+    <w:p>
+      <w:pPr>
+        <w:pStyle w:val="ListBullet"/>
+      </w:pPr>
+      <w:r>
+        <w:t>Preview test drive (</w:t>
+      </w:r>
+      <w:r>
+        <w:rPr>
+          <w:rFonts w:ascii="Consolas" w:hAnsi="Consolas"/>
+          <w:color w:val="7A3318"/>
+          <w:sz w:val="19"/>
+        </w:rPr>
+        <w:t>?preview=1</w:t>
+      </w:r>
+      <w:r>
+        <w:t>): researchers can click through the entire flow with nothing saved and all gates skippable — for checking a condition before sending links. A visible PREVIEW badge prevents confusion with real runs; preview runs cannot contaminate the dataset (no session row is created).</w:t>
+      </w:r>
+    </w:p>
+    <w:p>
+      <w:pPr>
+        <w:pStyle w:val="ListBullet"/>
+      </w:pPr>
+      <w:r>
+        <w:t>Refresh-resume continuity: survey page position and both chat conversations survive refreshes and redeploys (model history re-seeded server-side).</w:t>
+      </w:r>
+    </w:p>
+    <w:p>
+      <w:pPr>
         <w:pStyle w:val="Heading1"/>
       </w:pPr>
       <w:r>

</xml_diff>

<commit_message>
Change records: Round 9 (Gleb's 2026-06-16 main changes) + repoint to 14861550/thesis main
Record the 5 commits Gleb (SkullCandby) pushed to main on 2026-06-16 on top of the
Kaehl->main merge: FSCS-2 dropped / closeness collapsed to a single IOS item (flagged),
the 20s "Picture that future you" imagination hold-gate, the optional day-in-life Veo
video at the Phase B->C handoff (flagged), Stage-C reply-length variation, the Phase B
chooser redesign + Q&A rationale, and chip re-theming. Repoint both records' header and
footer from Lumingze13/BachelorThesis (Kaehl) to 14861550/thesis (main) -- now the
team's single working branch. Updated both the .md sources and the .docx.

https://claude.ai/code/session_01R4Y7QpEyP79hJdnUsCSFUb
</commit_message>
<xml_diff>
--- a/Brief_Change_Record.docx
+++ b/Brief_Change_Record.docx
@@ -12,27 +12,16 @@
     </w:p>
     <w:p>
       <w:r>
-        <w:t xml:space="preserve">Companion to </w:t>
+        <w:t xml:space="preserve">Companion to Project Status Brief v4.1. Evergreen: every design- or method-level change since v4.1 is recorded here until folded into a Brief v4.2. Implementation detail lives in the companion BUILD_PLAN_CHANGE_RECORD.md; this file records what matters for the STUDY — design, stimuli, measurement, ethics, analysis. Maintainer: Claude Code on behalf of Kangzhi Qin. </w:t>
       </w:r>
       <w:r>
         <w:rPr>
           <w:b/>
         </w:rPr>
-        <w:t>Project Status Brief v4.1</w:t>
+        <w:t>Canonical location as of 2026-06-16: repo 14861550/thesis, branch main</w:t>
       </w:r>
       <w:r>
-        <w:t xml:space="preserve">. Evergreen: every design- or method-level change since v4.1 is recorded here until folded into a Brief v4.2. Implementation detail lives in the companion </w:t>
-      </w:r>
-      <w:r>
-        <w:rPr>
-          <w:rFonts w:ascii="Consolas" w:hAnsi="Consolas"/>
-          <w:color w:val="7A3318"/>
-          <w:sz w:val="19"/>
-        </w:rPr>
-        <w:t>BUILD_PLAN_CHANGE_RECORD.md</w:t>
-      </w:r>
-      <w:r>
-        <w:t>; this file records what matters for the STUDY — design, stimuli, measurement, ethics, analysis. Maintainer: Claude Code on behalf of Kangzhi Qin.</w:t>
+        <w:t xml:space="preserve"> (the team's single working branch; earlier rounds were authored on the fork Lumingze13/BachelorThesis branch Kaehl and merged into main on 2026-06-15).</w:t>
       </w:r>
     </w:p>
     <w:p>
@@ -741,14 +730,132 @@
     <w:p/>
     <w:p>
       <w:pPr>
+        <w:pStyle w:val="Heading1"/>
+      </w:pPr>
+      <w:r>
+        <w:t>6. Changes landed on `main` by Gleb (2026-06-16) — not yet on Kaehl</w:t>
+      </w:r>
+    </w:p>
+    <w:p>
+      <w:pPr/>
+      <w:r>
+        <w:t>These are design-, stimulus- and measurement-level changes a teammate (Gleb Meshkov, `SkullCandby`, gdmeshkov@gmail.com) pushed to the team repo `14861550/thesis` branch `main` on 2026-06-16, after the Kaehl→main merge of 2026-06-15. They are not yet on the `Kaehl` branch. From this date the team works on `main`; this record is maintained there. Flagged where they bear on Kangzhi's design.</w:t>
+      </w:r>
+    </w:p>
+    <w:p>
+      <w:pPr>
+        <w:pStyle w:val="Heading2"/>
+      </w:pPr>
+      <w:r>
+        <w:t>6.1 Closeness measure changed — FSCS-2 dropped, single IOS item [FLAG]</w:t>
+      </w:r>
+    </w:p>
+    <w:p>
+      <w:pPr/>
+      <w:r>
+        <w:t xml:space="preserve">Closeness is now measured by the single IOS (Inclusion of Other in the Self) circles item, pre and post; the 2-item pictorial FSCS-2 continuity pair (similar / connected) was removed (in-code rationale: Shuai, 14 Jun, "redundant with the IOS item"). This directly amends §3's "what did NOT change" — which listed IOS + FSCS-2 as untouched — and one of Kangzhi's three mediators (closeness). It also propagates to Gleb's silicon self-report and the silicon-cohort validity check (now keyed on `ios_post`). </w:t>
+      </w:r>
+      <w:r>
+        <w:rPr>
+          <w:b/>
+        </w:rPr>
+        <w:t>Confirm the supervisor decision and update Brief §2.5 (Outcomes / Mediators / Measures) and Appendix F before fielding.</w:t>
+      </w:r>
+    </w:p>
+    <w:p>
+      <w:pPr>
+        <w:pStyle w:val="Heading2"/>
+      </w:pPr>
+      <w:r>
+        <w:t>6.2 New procedure element — future-self imagination gate</w:t>
+      </w:r>
+    </w:p>
+    <w:p>
+      <w:pPr/>
+      <w:r>
+        <w:t>A standalone "Picture that future you" page with a 20-second hold now precedes each closeness (IOS) measure, pre and post, in both arms — a brief structured imagination prompt immediately before the item. Note for the Method / Procedure section, and a possible measurement-reactivity consideration (an imagination prompt sits directly before the closeness rating).</w:t>
+      </w:r>
+    </w:p>
+    <w:p>
+      <w:pPr>
+        <w:pStyle w:val="Heading2"/>
+      </w:pPr>
+      <w:r>
+        <w:t>6.3 New optional stimulus — "day in the life" video [FLAG]</w:t>
+      </w:r>
+    </w:p>
+    <w:p>
+      <w:pPr/>
+      <w:r>
+        <w:t xml:space="preserve">An optional first-person POV video (or, with no video key, an auto-rotating text montage) of an ordinary weekday ten years on — generated from the chosen career, location and Phase-B conversation — can be shown at the Phase B→C handoff, after lock-in and before the role-play. </w:t>
+      </w:r>
+      <w:r>
+        <w:rPr>
+          <w:b/>
+        </w:rPr>
+        <w:t>OFF by default.</w:t>
+      </w:r>
+      <w:r>
+        <w:t xml:space="preserve"> This is a new pre-chat exposure inserted between phases; the implementing doc itself flags it as a protocol change that could confound the manipulation. Do not enable for the fielded study without team and ethics sign-off.</w:t>
+      </w:r>
+    </w:p>
+    <w:p>
+      <w:pPr>
+        <w:pStyle w:val="Heading2"/>
+      </w:pPr>
+      <w:r>
+        <w:t>6.4 Stage-C reply length now deliberately varied (both arms)</w:t>
+      </w:r>
+    </w:p>
+    <w:p>
+      <w:pPr/>
+      <w:r>
+        <w:t>The reply-length guidance changed from a fixed 2-3-paragraph target (§1.2) to deliberate variation — short answers for light / quick questions, up to 2-3 short paragraphs for weightier ones, with varied openings. Applied symmetrically, so not a condition confound, but it supersedes the v4.2 length wording.</w:t>
+      </w:r>
+    </w:p>
+    <w:p>
+      <w:pPr>
+        <w:pStyle w:val="Heading2"/>
+      </w:pPr>
+      <w:r>
+        <w:t>6.5 Phase B rationale documented; chooser redesigned</w:t>
+      </w:r>
+    </w:p>
+    <w:p>
+      <w:pPr/>
+      <w:r>
+        <w:t>A short note answers Shuai's 14 Jun question — why Phase B asks a few open questions before recommending careers rather than computing them straight from the questionnaire (the questionnaire is descriptive, not prescriptive; the conversation captures current wants, surfaces options the student doesn't know exist, grounds geography, and builds continuity into Phase C). Design rationale only — no method change. The Phase-B career chooser UI was also redesigned (an in-flow affordance replacing a stranded ghost button).</w:t>
+      </w:r>
+    </w:p>
+    <w:p>
+      <w:pPr>
+        <w:pStyle w:val="Heading2"/>
+      </w:pPr>
+      <w:r>
+        <w:t>6.6 Participant copy</w:t>
+      </w:r>
+    </w:p>
+    <w:p>
+      <w:pPr/>
+      <w:r>
+        <w:t>AI-sounding headings / intros reworded; the suggested-question ("Ideas to ask") chips reorganized by theme and sampled across themes (still a fixed pool, identical across arms — §1.3 unchanged in substance).</w:t>
+      </w:r>
+    </w:p>
+    <w:p>
+      <w:pPr/>
+      <w:r>
+        <w:rPr>
+          <w:i/>
+        </w:rPr>
+        <w:t>Provenance: all by Gleb Meshkov (`SkullCandby`, gdmeshkov@gmail.com), 2026-06-16, commits `635dd77`, `5cb3b6c`, `5009ad0`, `29c6164`, `c24802e`.</w:t>
+      </w:r>
+    </w:p>
+    <w:p>
+      <w:pPr>
         <w:jc w:val="center"/>
       </w:pPr>
       <w:r>
-        <w:rPr>
-          <w:color w:val="8C8C88"/>
-          <w:sz w:val="17"/>
-        </w:rPr>
-        <w:t>Living record · changes since Project Status Brief v4.1 · markdown source: BRIEF_CHANGE_RECORD.md · repo Lumingze13/BachelorThesis (Kaehl)</w:t>
+        <w:t>Living record · changes since Project Status Brief v4.1 · markdown source: BRIEF_CHANGE_RECORD.md · repo 14861550/thesis (main)</w:t>
       </w:r>
     </w:p>
     <w:sectPr>

</xml_diff>